<commit_message>
Update Appearing in Media as expert on Caffeine Withdrawal.docx
</commit_message>
<xml_diff>
--- a/press/Appearing in Media as expert on Caffeine Withdrawal.docx
+++ b/press/Appearing in Media as expert on Caffeine Withdrawal.docx
@@ -512,6 +512,31 @@
       </w:r>
     </w:p>
     <w:p/>
+    <w:p>
+      <w:pPr>
+        <w:numPr>
+          <w:ilvl w:val="0"/>
+          <w:numId w:val="3"/>
+        </w:numPr>
+        <w:pBdr>
+          <w:top w:val="nil"/>
+          <w:left w:val="nil"/>
+          <w:bottom w:val="nil"/>
+          <w:right w:val="nil"/>
+          <w:between w:val="nil"/>
+        </w:pBdr>
+        <w:ind w:left="851"/>
+        <w:rPr>
+          <w:color w:val="000000"/>
+        </w:rPr>
+      </w:pPr>
+      <w:r>
+        <w:rPr>
+          <w:color w:val="000000"/>
+        </w:rPr>
+        <w:t>Australian Financial Review: Interview with Euan Black (02/12/2025)</w:t>
+      </w:r>
+    </w:p>
     <w:p>
       <w:pPr>
         <w:numPr>

</xml_diff>